<commit_message>
integrated code scannerwith ML risk engineand updated generator
</commit_message>
<xml_diff>
--- a/test_cases.docx
+++ b/test_cases.docx
@@ -11,143 +11,596 @@
       </w:r>
     </w:p>
     <w:p>
+      <w:pPr>
+        <w:pStyle w:val="Heading2"/>
+      </w:pPr>
       <w:r>
-        <w:t>TC001 - [MAE ONLINE] Verify frontend allows transaction when RMBP=ON</w:t>
+        <w:t>TC_001 - Verify SST calculation applied correctly on Service Fee</w:t>
       </w:r>
     </w:p>
     <w:p>
       <w:r>
-        <w:t>TC002 - [MAE ONLINE] Verify backend propagates SST when DCC=ON</w:t>
+        <w:t>Module: BAKONG</w:t>
       </w:r>
     </w:p>
     <w:p>
       <w:r>
-        <w:t>TC003 - [MAE ONLINE] Verify SST calculated correctly at configured percentage</w:t>
+        <w:t>Channel: MAE</w:t>
       </w:r>
     </w:p>
     <w:p>
       <w:r>
-        <w:t>TC004 - [MAE ONLINE] Verify total amount = principal + fee + SST</w:t>
+        <w:t>Priority: High</w:t>
       </w:r>
     </w:p>
     <w:p>
       <w:r>
-        <w:t>TC005 - [MAE ONLINE] Verify ESB payload contains SST</w:t>
+        <w:t>Type: Manual</w:t>
       </w:r>
     </w:p>
     <w:p>
       <w:r>
-        <w:t>TC006 - [MAE ONLINE] Verify CICS maps SST correctly</w:t>
+        <w:t>Precondition:</w:t>
       </w:r>
     </w:p>
     <w:p>
       <w:r>
-        <w:t>TC007 - [MAE ONLINE] Verify core banking deducts total including SST</w:t>
+        <w:t>User logged into MAE and navigated to BAKONG module</w:t>
       </w:r>
     </w:p>
     <w:p>
       <w:r>
-        <w:t>TC008 - [MAE ONLINE] Verify debit-credit reconciliation in core banking</w:t>
+        <w:t>Steps:</w:t>
       </w:r>
     </w:p>
     <w:p>
       <w:r>
-        <w:t>TC009 - [MAE ONLINE] Validate API request includes SST field</w:t>
+        <w:t>1. Initiate transfer</w:t>
+        <w:br/>
+        <w:t>2. Enter transfer amount</w:t>
+        <w:br/>
+        <w:t>3. Proceed to confirmation page</w:t>
+        <w:br/>
+        <w:t>4. Validate SST calculation</w:t>
       </w:r>
     </w:p>
     <w:p>
       <w:r>
-        <w:t>TC010 - [MAE ONLINE] Validate API response reflects updated fee structure</w:t>
+        <w:t>Expected Result:</w:t>
       </w:r>
     </w:p>
     <w:p>
       <w:r>
-        <w:t>TC011 - [MAE ONLINE] Verify CCPP reflects SST component correctly</w:t>
+        <w:t>SST must be calculated as per configured percentage and reflected correctly</w:t>
       </w:r>
     </w:p>
     <w:p>
       <w:r>
-        <w:t>TC012 - [MAE ONLINE] Verify RSA CQ/Deny/Review flow unaffected</w:t>
+        <w:br w:type="page"/>
+      </w:r>
+    </w:p>
+    <w:p>
+      <w:pPr>
+        <w:pStyle w:val="Heading2"/>
+      </w:pPr>
+      <w:r>
+        <w:t>TC_002 - Verify feature flag ON/OFF behavior</w:t>
       </w:r>
     </w:p>
     <w:p>
       <w:r>
-        <w:t>TC013 - [MAE OFFLINE] Verify frontend hides SST when RMBP=OFF</w:t>
+        <w:t>Module: BAKONG</w:t>
       </w:r>
     </w:p>
     <w:p>
       <w:r>
-        <w:t>TC014 - [MAE OFFLINE] Verify backend suppresses SST when DCC=OFF</w:t>
+        <w:t>Channel: MAE</w:t>
       </w:r>
     </w:p>
     <w:p>
       <w:r>
-        <w:t>TC015 - [MAE OFFLINE] Verify no SST calculated</w:t>
+        <w:t>Priority: High</w:t>
       </w:r>
     </w:p>
     <w:p>
       <w:r>
-        <w:t>TC016 - [MAE OFFLINE] Verify total amount excludes SST</w:t>
+        <w:t>Type: Manual</w:t>
       </w:r>
     </w:p>
     <w:p>
       <w:r>
-        <w:t>TC017 - [MAE OFFLINE] Verify ESB payload excludes SST</w:t>
+        <w:t>Precondition:</w:t>
       </w:r>
     </w:p>
     <w:p>
       <w:r>
-        <w:t>TC018 - [MAE OFFLINE] Verify CICS does not map SST</w:t>
+        <w:t>User logged into MAE and navigated to BAKONG module</w:t>
       </w:r>
     </w:p>
     <w:p>
       <w:r>
-        <w:t>TC019 - [MAE OFFLINE] Verify core banking deducts without SST</w:t>
+        <w:t>Steps:</w:t>
       </w:r>
     </w:p>
     <w:p>
       <w:r>
-        <w:t>TC020 - [MAE OFFLINE] Verify debit-credit reconciliation without SST</w:t>
+        <w:t>1. Enable feature flag</w:t>
+        <w:br/>
+        <w:t>2. Perform transfer</w:t>
+        <w:br/>
+        <w:t>3. Disable feature flag</w:t>
+        <w:br/>
+        <w:t>4. Perform transfer again</w:t>
       </w:r>
     </w:p>
     <w:p>
       <w:r>
-        <w:t>TC021 - [MAE OFFLINE] Validate API request excludes SST field</w:t>
+        <w:t>Expected Result:</w:t>
       </w:r>
     </w:p>
     <w:p>
       <w:r>
-        <w:t>TC022 - [MAE OFFLINE] Validate API response excludes SST structure</w:t>
+        <w:t>System behavior must change according to feature flag state</w:t>
       </w:r>
     </w:p>
     <w:p>
       <w:r>
-        <w:t>TC023 - Verify minimum transfer boundary amount</w:t>
+        <w:br w:type="page"/>
+      </w:r>
+    </w:p>
+    <w:p>
+      <w:pPr>
+        <w:pStyle w:val="Heading2"/>
+      </w:pPr>
+      <w:r>
+        <w:t>TC_003 - Verify performance under high transaction load</w:t>
       </w:r>
     </w:p>
     <w:p>
       <w:r>
-        <w:t>TC024 - Verify maximum transfer boundary amount</w:t>
+        <w:t>Module: BAKONG</w:t>
       </w:r>
     </w:p>
     <w:p>
       <w:r>
-        <w:t>TC025 - Verify invalid amount scenario</w:t>
+        <w:t>Channel: MAE</w:t>
       </w:r>
     </w:p>
     <w:p>
       <w:r>
-        <w:t>TC026 - Verify invalid currency scenario</w:t>
+        <w:t>Priority: Medium</w:t>
       </w:r>
     </w:p>
     <w:p>
       <w:r>
-        <w:t>TC027 - Verify concurrent transactions handled correctly</w:t>
+        <w:t>Type: Manual</w:t>
       </w:r>
     </w:p>
     <w:p>
       <w:r>
-        <w:t>TC028 - Verify performance under peak load</w:t>
+        <w:t>Precondition:</w:t>
+      </w:r>
+    </w:p>
+    <w:p>
+      <w:r>
+        <w:t>User logged into MAE and navigated to BAKONG module</w:t>
+      </w:r>
+    </w:p>
+    <w:p>
+      <w:r>
+        <w:t>Steps:</w:t>
+      </w:r>
+    </w:p>
+    <w:p>
+      <w:r>
+        <w:t>1. Simulate multiple concurrent transfers</w:t>
+        <w:br/>
+        <w:t>2. Monitor system response time</w:t>
+      </w:r>
+    </w:p>
+    <w:p>
+      <w:r>
+        <w:t>Expected Result:</w:t>
+      </w:r>
+    </w:p>
+    <w:p>
+      <w:r>
+        <w:t>System should handle concurrent load without failure</w:t>
+      </w:r>
+    </w:p>
+    <w:p>
+      <w:r>
+        <w:br w:type="page"/>
+      </w:r>
+    </w:p>
+    <w:p>
+      <w:pPr>
+        <w:pStyle w:val="Heading2"/>
+      </w:pPr>
+      <w:r>
+        <w:t>TC_004 - Verify transfer limit boundary validation</w:t>
+      </w:r>
+    </w:p>
+    <w:p>
+      <w:r>
+        <w:t>Module: BAKONG</w:t>
+      </w:r>
+    </w:p>
+    <w:p>
+      <w:r>
+        <w:t>Channel: MAE</w:t>
+      </w:r>
+    </w:p>
+    <w:p>
+      <w:r>
+        <w:t>Priority: High</w:t>
+      </w:r>
+    </w:p>
+    <w:p>
+      <w:r>
+        <w:t>Type: Manual</w:t>
+      </w:r>
+    </w:p>
+    <w:p>
+      <w:r>
+        <w:t>Precondition:</w:t>
+      </w:r>
+    </w:p>
+    <w:p>
+      <w:r>
+        <w:t>User logged into MAE and navigated to BAKONG module</w:t>
+      </w:r>
+    </w:p>
+    <w:p>
+      <w:r>
+        <w:t>Steps:</w:t>
+      </w:r>
+    </w:p>
+    <w:p>
+      <w:r>
+        <w:t>1. Enter transfer amount equal to daily limit</w:t>
+        <w:br/>
+        <w:t>2. Submit transfer</w:t>
+      </w:r>
+    </w:p>
+    <w:p>
+      <w:r>
+        <w:t>Expected Result:</w:t>
+      </w:r>
+    </w:p>
+    <w:p>
+      <w:r>
+        <w:t>System should allow transfer within configured limit</w:t>
+      </w:r>
+    </w:p>
+    <w:p>
+      <w:r>
+        <w:br w:type="page"/>
+      </w:r>
+    </w:p>
+    <w:p>
+      <w:pPr>
+        <w:pStyle w:val="Heading2"/>
+      </w:pPr>
+      <w:r>
+        <w:t>TC_005 - Verify transfer exceeding daily limit is rejected</w:t>
+      </w:r>
+    </w:p>
+    <w:p>
+      <w:r>
+        <w:t>Module: BAKONG</w:t>
+      </w:r>
+    </w:p>
+    <w:p>
+      <w:r>
+        <w:t>Channel: MAE</w:t>
+      </w:r>
+    </w:p>
+    <w:p>
+      <w:r>
+        <w:t>Priority: High</w:t>
+      </w:r>
+    </w:p>
+    <w:p>
+      <w:r>
+        <w:t>Type: Manual</w:t>
+      </w:r>
+    </w:p>
+    <w:p>
+      <w:r>
+        <w:t>Precondition:</w:t>
+      </w:r>
+    </w:p>
+    <w:p>
+      <w:r>
+        <w:t>User logged into MAE and navigated to BAKONG module</w:t>
+      </w:r>
+    </w:p>
+    <w:p>
+      <w:r>
+        <w:t>Steps:</w:t>
+      </w:r>
+    </w:p>
+    <w:p>
+      <w:r>
+        <w:t>1. Enter transfer amount exceeding daily limit</w:t>
+        <w:br/>
+        <w:t>2. Submit transfer</w:t>
+      </w:r>
+    </w:p>
+    <w:p>
+      <w:r>
+        <w:t>Expected Result:</w:t>
+      </w:r>
+    </w:p>
+    <w:p>
+      <w:r>
+        <w:t>System must reject transaction exceeding configured limit</w:t>
+      </w:r>
+    </w:p>
+    <w:p>
+      <w:r>
+        <w:br w:type="page"/>
+      </w:r>
+    </w:p>
+    <w:p>
+      <w:pPr>
+        <w:pStyle w:val="Heading2"/>
+      </w:pPr>
+      <w:r>
+        <w:t>TC_006 - Verify fee rounding precision</w:t>
+      </w:r>
+    </w:p>
+    <w:p>
+      <w:r>
+        <w:t>Module: BAKONG</w:t>
+      </w:r>
+    </w:p>
+    <w:p>
+      <w:r>
+        <w:t>Channel: MAE</w:t>
+      </w:r>
+    </w:p>
+    <w:p>
+      <w:r>
+        <w:t>Priority: High</w:t>
+      </w:r>
+    </w:p>
+    <w:p>
+      <w:r>
+        <w:t>Type: Manual</w:t>
+      </w:r>
+    </w:p>
+    <w:p>
+      <w:r>
+        <w:t>Precondition:</w:t>
+      </w:r>
+    </w:p>
+    <w:p>
+      <w:r>
+        <w:t>User logged into MAE and navigated to BAKONG module</w:t>
+      </w:r>
+    </w:p>
+    <w:p>
+      <w:r>
+        <w:t>Steps:</w:t>
+      </w:r>
+    </w:p>
+    <w:p>
+      <w:r>
+        <w:t>1. Enter amount with decimal value</w:t>
+        <w:br/>
+        <w:t>2. Proceed to confirmation</w:t>
+      </w:r>
+    </w:p>
+    <w:p>
+      <w:r>
+        <w:t>Expected Result:</w:t>
+      </w:r>
+    </w:p>
+    <w:p>
+      <w:r>
+        <w:t>Fee must be rounded correctly as per business rules</w:t>
+      </w:r>
+    </w:p>
+    <w:p>
+      <w:r>
+        <w:br w:type="page"/>
+      </w:r>
+    </w:p>
+    <w:p>
+      <w:pPr>
+        <w:pStyle w:val="Heading2"/>
+      </w:pPr>
+      <w:r>
+        <w:t>TC_007 - Verify SST applied to both service fee and agent fee</w:t>
+      </w:r>
+    </w:p>
+    <w:p>
+      <w:r>
+        <w:t>Module: BAKONG</w:t>
+      </w:r>
+    </w:p>
+    <w:p>
+      <w:r>
+        <w:t>Channel: MAE</w:t>
+      </w:r>
+    </w:p>
+    <w:p>
+      <w:r>
+        <w:t>Priority: High</w:t>
+      </w:r>
+    </w:p>
+    <w:p>
+      <w:r>
+        <w:t>Type: Manual</w:t>
+      </w:r>
+    </w:p>
+    <w:p>
+      <w:r>
+        <w:t>Precondition:</w:t>
+      </w:r>
+    </w:p>
+    <w:p>
+      <w:r>
+        <w:t>User logged into MAE and navigated to BAKONG module</w:t>
+      </w:r>
+    </w:p>
+    <w:p>
+      <w:r>
+        <w:t>Steps:</w:t>
+      </w:r>
+    </w:p>
+    <w:p>
+      <w:r>
+        <w:t>1. Initiate transfer</w:t>
+        <w:br/>
+        <w:t>2. Review fee breakdown</w:t>
+      </w:r>
+    </w:p>
+    <w:p>
+      <w:r>
+        <w:t>Expected Result:</w:t>
+      </w:r>
+    </w:p>
+    <w:p>
+      <w:r>
+        <w:t>SST must be applied to all applicable fee components</w:t>
+      </w:r>
+    </w:p>
+    <w:p>
+      <w:r>
+        <w:br w:type="page"/>
+      </w:r>
+    </w:p>
+    <w:p>
+      <w:pPr>
+        <w:pStyle w:val="Heading2"/>
+      </w:pPr>
+      <w:r>
+        <w:t>TC_008 - Verify system error handling during transaction failure</w:t>
+      </w:r>
+    </w:p>
+    <w:p>
+      <w:r>
+        <w:t>Module: BAKONG</w:t>
+      </w:r>
+    </w:p>
+    <w:p>
+      <w:r>
+        <w:t>Channel: MAE</w:t>
+      </w:r>
+    </w:p>
+    <w:p>
+      <w:r>
+        <w:t>Priority: High</w:t>
+      </w:r>
+    </w:p>
+    <w:p>
+      <w:r>
+        <w:t>Type: Manual</w:t>
+      </w:r>
+    </w:p>
+    <w:p>
+      <w:r>
+        <w:t>Precondition:</w:t>
+      </w:r>
+    </w:p>
+    <w:p>
+      <w:r>
+        <w:t>User logged into MAE and navigated to BAKONG module</w:t>
+      </w:r>
+    </w:p>
+    <w:p>
+      <w:r>
+        <w:t>Steps:</w:t>
+      </w:r>
+    </w:p>
+    <w:p>
+      <w:r>
+        <w:t>1. Simulate backend failure</w:t>
+        <w:br/>
+        <w:t>2. Submit transfer</w:t>
+      </w:r>
+    </w:p>
+    <w:p>
+      <w:r>
+        <w:t>Expected Result:</w:t>
+      </w:r>
+    </w:p>
+    <w:p>
+      <w:r>
+        <w:t>System must show proper error message and prevent transaction completion</w:t>
+      </w:r>
+    </w:p>
+    <w:p>
+      <w:r>
+        <w:br w:type="page"/>
+      </w:r>
+    </w:p>
+    <w:p>
+      <w:pPr>
+        <w:pStyle w:val="Heading2"/>
+      </w:pPr>
+      <w:r>
+        <w:t>TC_009 - Verify mandatory field validation</w:t>
+      </w:r>
+    </w:p>
+    <w:p>
+      <w:r>
+        <w:t>Module: BAKONG</w:t>
+      </w:r>
+    </w:p>
+    <w:p>
+      <w:r>
+        <w:t>Channel: MAE</w:t>
+      </w:r>
+    </w:p>
+    <w:p>
+      <w:r>
+        <w:t>Priority: High</w:t>
+      </w:r>
+    </w:p>
+    <w:p>
+      <w:r>
+        <w:t>Type: Manual</w:t>
+      </w:r>
+    </w:p>
+    <w:p>
+      <w:r>
+        <w:t>Precondition:</w:t>
+      </w:r>
+    </w:p>
+    <w:p>
+      <w:r>
+        <w:t>User logged into MAE and navigated to BAKONG module</w:t>
+      </w:r>
+    </w:p>
+    <w:p>
+      <w:r>
+        <w:t>Steps:</w:t>
+      </w:r>
+    </w:p>
+    <w:p>
+      <w:r>
+        <w:t>1. Leave mandatory fields blank</w:t>
+        <w:br/>
+        <w:t>2. Attempt to submit transfer</w:t>
+      </w:r>
+    </w:p>
+    <w:p>
+      <w:r>
+        <w:t>Expected Result:</w:t>
+      </w:r>
+    </w:p>
+    <w:p>
+      <w:r>
+        <w:t>System must display validation message for mandatory fields</w:t>
+      </w:r>
+    </w:p>
+    <w:p>
+      <w:r>
+        <w:br w:type="page"/>
       </w:r>
     </w:p>
     <w:sectPr>

</xml_diff>